<commit_message>
Complete Phase 7 SQL analytics and update project documentation
</commit_message>
<xml_diff>
--- a/sql/Phase 6_analytics requirements & reporting design/01_Phase_6_Analytics_Requirements.docx
+++ b/sql/Phase 6_analytics requirements & reporting design/01_Phase_6_Analytics_Requirements.docx
@@ -25,7 +25,7 @@
     </w:p>
     <w:p>
       <w:r>
-        <w:t>PHASE 6 DOCUMENTATION CLOSED — cross-document consistency review completed; SQL/Power BI implementation and acceptance testing remain pending.</w:t>
+        <w:t>PHASE 6 DOCUMENTATION — revised after SQL 7.12 profitability validation; SQL/Power BI implementation and acceptance testing remain pending.</w:t>
       </w:r>
     </w:p>
     <w:p>
@@ -639,11 +639,9 @@
         <w:rPr>
           <w:b/>
         </w:rPr>
-        <w:t xml:space="preserve">Estimated Gross Profit: </w:t>
+        <w:t>Estimated Gross Profit: Eligible completed-order sales less estimated product cost using current product costs. SQL 7.12 validated AED 5,360 (AED 26,870 eligible sales less AED 21,510 estimated product cost). The earlier Phase 6 benchmark of AED 7,603 differs by AED 2,243 and is retained as a superseded reference pending explanation; it is not an adjustment.</w:t>
       </w:r>
-      <w:r>
-        <w:t>Eligible sales less estimated product cost. The validated AED 7,603 estimate uses current product costs, not historical costs.</w:t>
-      </w:r>
+      <w:r/>
     </w:p>
     <w:p>
       <w:pPr>
@@ -653,11 +651,9 @@
         <w:rPr>
           <w:b/>
         </w:rPr>
-        <w:t xml:space="preserve">Estimated Profit Margin: </w:t>
+        <w:t>Estimated Profit Margin: Estimated gross profit divided by eligible completed-order sales × 100. SQL 7.12 validated 19.95% (AED 5,360 / AED 26,870). Label as estimated; guard against zero sales.</w:t>
       </w:r>
-      <w:r>
-        <w:t>Estimated gross profit divided by eligible sales × 100. Label as estimated; guard against zero sales.</w:t>
-      </w:r>
+      <w:r/>
     </w:p>
     <w:p>
       <w:pPr>
@@ -834,7 +830,7 @@
         <w:pStyle w:val="ListBullet"/>
       </w:pPr>
       <w:r>
-        <w:t>Inventory movement is unavailable for trend analysis: PostgreSQL table has 0 rows due to the documented dependency exception.</w:t>
+        <w:t>Profitability validation: SQL 7.12 reconciled 15 completed orders, 19 sales lines, 21 units, AED 26,870 sales, AED 21,510 estimated product cost, AED 5,360 estimated gross profit and 19.95% estimated profit margin. The previous AED 7,603 benchmark remains unexplained; the AED 2,243 variance is documented, not adjusted. Inventory movement is unavailable for trend analysis: PostgreSQL table has 0 rows due to the documented dependency exception.</w:t>
       </w:r>
     </w:p>
     <w:p>
@@ -1031,7 +1027,7 @@
     </w:p>
     <w:p>
       <w:r>
-        <w:t>Report Estimated Gross Profit as eligible completed-order sales less estimated product cost using current product costs. Label the result and its margin as estimated; do not represent them as historical or audited profit. Keep discounts, tax, shipping and returns separate unless their treatment is supported and approved.</w:t>
+        <w:t>Report Estimated Gross Profit as eligible completed-order sales less estimated product cost using current product costs. SQL 7.12 validation: sales AED 26,870; estimated product cost AED 21,510; estimated gross profit AED 5,360; estimated profit margin 19.95%. The earlier AED 7,603 benchmark is superseded for reporting; its AED 2,243 difference remains unexplained and must not be used as an adjustment. Label the result and its margin as estimated; do not represent them as historical or audited profit. Keep discounts, tax, shipping and returns separate unless their treatment is supported and approved.</w:t>
       </w:r>
     </w:p>
     <w:p>
@@ -1118,7 +1114,7 @@
         <w:pStyle w:val="ListBullet"/>
       </w:pPr>
       <w:r>
-        <w:t>Final cross-document consistency review completed; Phase 6 documentation closure recorded. Implementation and acceptance testing remain subsequent work.</w:t>
+        <w:t>This Analytics Requirements document has been revised to incorporate SQL 7.12 profitability validation. Before treating Phase 6 cross-document consistency as current, update the KPI workbook and Power BI Requirements document to the same validated profitability figures. SQL/Power BI implementation and acceptance testing remain subsequent work.</w:t>
       </w:r>
     </w:p>
     <w:sectPr>

</xml_diff>